<commit_message>
chore(release): auditoria total y consolidacion de cambios (Front/Back/DB) para pase a Produccion
</commit_message>
<xml_diff>
--- a/Supporting Documents/Prompt para sub modulo Playbook Designer que pertenece al Módulo Growthify.docx
+++ b/Supporting Documents/Prompt para sub modulo Playbook Designer que pertenece al Módulo Growthify.docx
@@ -112,7 +112,13 @@
       </w:r>
       <w:proofErr w:type="spellStart"/>
       <w:r>
-        <w:t>PLaybook</w:t>
+        <w:t>P</w:t>
+      </w:r>
+      <w:r>
+        <w:t>l</w:t>
+      </w:r>
+      <w:r>
+        <w:t>aybook</w:t>
       </w:r>
       <w:proofErr w:type="spellEnd"/>
       <w:r>
@@ -460,15 +466,7 @@
       </w:r>
       <w:proofErr w:type="spellEnd"/>
       <w:r>
-        <w:t xml:space="preserve"> hasta 1000 caracteres </w:t>
-      </w:r>
-      <w:proofErr w:type="gramStart"/>
-      <w:r>
-        <w:t>( Campo</w:t>
-      </w:r>
-      <w:proofErr w:type="gramEnd"/>
-      <w:r>
-        <w:t xml:space="preserve"> de texto libre para que el redactor pueda describir el propósito) 11. </w:t>
+        <w:t xml:space="preserve"> hasta 1000 caracteres ( Campo de texto libre para que el redactor pueda describir el propósito) 11. </w:t>
       </w:r>
       <w:proofErr w:type="spellStart"/>
       <w:r>
@@ -476,15 +474,7 @@
       </w:r>
       <w:proofErr w:type="spellEnd"/>
       <w:r>
-        <w:t xml:space="preserve"> Role (este campo será de libre texto para que el creador cree participantes externos, </w:t>
-      </w:r>
-      <w:proofErr w:type="gramStart"/>
-      <w:r>
-        <w:t>ejemplo :</w:t>
-      </w:r>
-      <w:proofErr w:type="gramEnd"/>
-      <w:r>
-        <w:t xml:space="preserve"> “Realtor”, ejemplo: “Broker” los nombres de participantes externos son reutilizables en todos los </w:t>
+        <w:t xml:space="preserve"> Role (este campo será de libre texto para que el creador cree participantes externos, ejemplo : “Realtor”, ejemplo: “Broker” los nombres de participantes externos son reutilizables en todos los </w:t>
       </w:r>
       <w:proofErr w:type="spellStart"/>
       <w:r>
@@ -495,12 +485,10 @@
         <w:t xml:space="preserve"> que se creen a lo largo del mismo </w:t>
       </w:r>
       <w:proofErr w:type="spellStart"/>
-      <w:proofErr w:type="gramStart"/>
       <w:r>
         <w:t>tenant</w:t>
       </w:r>
       <w:proofErr w:type="spellEnd"/>
-      <w:proofErr w:type="gramEnd"/>
       <w:r>
         <w:t xml:space="preserve"> pero no s </w:t>
       </w:r>
@@ -510,15 +498,7 @@
       </w:r>
       <w:proofErr w:type="spellEnd"/>
       <w:r>
-        <w:t xml:space="preserve"> crear un nombre de role que ya exista en internos o </w:t>
-      </w:r>
-      <w:proofErr w:type="gramStart"/>
-      <w:r>
-        <w:t>externos,.</w:t>
-      </w:r>
-      <w:proofErr w:type="gramEnd"/>
-      <w:r>
-        <w:t xml:space="preserve"> 12. </w:t>
+        <w:t xml:space="preserve"> crear un nombre de role que ya exista en internos o externos,. 12. </w:t>
       </w:r>
       <w:proofErr w:type="spellStart"/>
       <w:r>
@@ -698,15 +678,7 @@
       </w:r>
       <w:proofErr w:type="spellEnd"/>
       <w:r>
-        <w:t xml:space="preserve"> automáticamente del campo oficial que describe a </w:t>
-      </w:r>
-      <w:proofErr w:type="gramStart"/>
-      <w:r>
-        <w:t>ese position</w:t>
-      </w:r>
-      <w:proofErr w:type="gramEnd"/>
-      <w:r>
-        <w:t xml:space="preserve">, correspondiente de la tabla de Job Titles, de cuando HR creó ese Job </w:t>
+        <w:t xml:space="preserve"> automáticamente del campo oficial que describe a ese position, correspondiente de la tabla de Job Titles, de cuando HR creó ese Job </w:t>
       </w:r>
       <w:proofErr w:type="spellStart"/>
       <w:r>
@@ -762,15 +734,7 @@
       </w:r>
       <w:proofErr w:type="spellEnd"/>
       <w:r>
-        <w:t xml:space="preserve"> Name (Libre </w:t>
-      </w:r>
-      <w:proofErr w:type="gramStart"/>
-      <w:r>
-        <w:t>texto</w:t>
-      </w:r>
-      <w:proofErr w:type="gramEnd"/>
-      <w:r>
-        <w:t xml:space="preserve"> pero no podrá crearse un nombre que coincida con un nombre ya existente, ejemplo: “llamar por teléfono”), máximo 40 caracteres alfa </w:t>
+        <w:t xml:space="preserve"> Name (Libre texto pero no podrá crearse un nombre que coincida con un nombre ya existente, ejemplo: “llamar por teléfono”), máximo 40 caracteres alfa </w:t>
       </w:r>
       <w:proofErr w:type="spellStart"/>
       <w:r>
@@ -1045,17 +1009,12 @@
         <w:t xml:space="preserve">, </w:t>
       </w:r>
       <w:proofErr w:type="spellStart"/>
-      <w:proofErr w:type="gramStart"/>
       <w:r>
         <w:t>Yearly</w:t>
       </w:r>
       <w:proofErr w:type="spellEnd"/>
       <w:r>
-        <w:t>….</w:t>
-      </w:r>
-      <w:proofErr w:type="gramEnd"/>
-      <w:r>
-        <w:t xml:space="preserve">.marca cada cuanto se debe hacer la actividad, ejemplo: 8 llamadas “Daily” </w:t>
+        <w:t xml:space="preserve">…..marca cada cuanto se debe hacer la actividad, ejemplo: 8 llamadas “Daily” </w:t>
       </w:r>
       <w:proofErr w:type="spellStart"/>
       <w:r>
@@ -1151,15 +1110,7 @@
       </w:r>
       <w:proofErr w:type="spellEnd"/>
       <w:r>
-        <w:t xml:space="preserve"> X…</w:t>
-      </w:r>
-      <w:proofErr w:type="gramStart"/>
-      <w:r>
-        <w:t>todos estos fuentes</w:t>
-      </w:r>
-      <w:proofErr w:type="gramEnd"/>
-      <w:r>
-        <w:t xml:space="preserve"> se podrán crear en otro panel de fuentes de verdad, por ahora comencemos con esos). Area </w:t>
+        <w:t xml:space="preserve"> X…todos estos fuentes se podrán crear en otro panel de fuentes de verdad, por ahora comencemos con esos). Area </w:t>
       </w:r>
       <w:proofErr w:type="spellStart"/>
       <w:r>
@@ -1167,15 +1118,7 @@
       </w:r>
       <w:proofErr w:type="spellEnd"/>
       <w:r>
-        <w:t xml:space="preserve">: Es </w:t>
-      </w:r>
-      <w:proofErr w:type="gramStart"/>
-      <w:r>
-        <w:t>todo un área</w:t>
-      </w:r>
-      <w:proofErr w:type="gramEnd"/>
-      <w:r>
-        <w:t xml:space="preserve"> con campos y </w:t>
+        <w:t xml:space="preserve">: Es todo un área con campos y </w:t>
       </w:r>
       <w:proofErr w:type="spellStart"/>
       <w:r>
@@ -1183,15 +1126,7 @@
       </w:r>
       <w:proofErr w:type="spellEnd"/>
       <w:r>
-        <w:t xml:space="preserve">, Permitirá al redactor ver </w:t>
-      </w:r>
-      <w:proofErr w:type="gramStart"/>
-      <w:r>
-        <w:t>todos los pool</w:t>
-      </w:r>
-      <w:proofErr w:type="gramEnd"/>
-      <w:r>
-        <w:t xml:space="preserve"> de categorías y actividades creadas, y poderles asignar SLA con un campo 26. Nombre del KPI (libre edición, 100 caracteres) 27. KPI ID (numeración automática con nemotecnia </w:t>
+        <w:t xml:space="preserve">, Permitirá al redactor ver todos los pool de categorías y actividades creadas, y poderles asignar SLA con un campo 26. Nombre del KPI (libre edición, 100 caracteres) 27. KPI ID (numeración automática con nemotecnia </w:t>
       </w:r>
       <w:proofErr w:type="spellStart"/>
       <w:r>
@@ -1215,15 +1150,7 @@
       </w:r>
       <w:proofErr w:type="spellEnd"/>
       <w:r>
-        <w:t xml:space="preserve"> podrá hacer uso de conectores lógicos # máximo de, # mínimo de, sea = </w:t>
-      </w:r>
-      <w:proofErr w:type="gramStart"/>
-      <w:r>
-        <w:t>a ,</w:t>
-      </w:r>
-      <w:proofErr w:type="gramEnd"/>
-      <w:r>
-        <w:t xml:space="preserve"> o mayor que, menor que, y muchos otros que diseñe el Agente de IA conforma a las </w:t>
+        <w:t xml:space="preserve"> podrá hacer uso de conectores lógicos # máximo de, # mínimo de, sea = a , o mayor que, menor que, y muchos otros que diseñe el Agente de IA conforma a las </w:t>
       </w:r>
       <w:r>
         <w:lastRenderedPageBreak/>
@@ -1317,21 +1244,7 @@
         <w:rPr>
           <w:lang w:val="en-US"/>
         </w:rPr>
-        <w:t xml:space="preserve">, Quarterly, Per Semester, </w:t>
-      </w:r>
-      <w:proofErr w:type="gramStart"/>
-      <w:r>
-        <w:rPr>
-          <w:lang w:val="en-US"/>
-        </w:rPr>
-        <w:t>Yearly )</w:t>
-      </w:r>
-      <w:proofErr w:type="gramEnd"/>
-      <w:r>
-        <w:rPr>
-          <w:lang w:val="en-US"/>
-        </w:rPr>
-        <w:t xml:space="preserve">. </w:t>
+        <w:t xml:space="preserve">, Quarterly, Per Semester, Yearly ). </w:t>
       </w:r>
       <w:r>
         <w:t xml:space="preserve">30. Formula </w:t>
@@ -2434,12 +2347,10 @@
         <w:t xml:space="preserve">. Todo tendrá su ligar en las cajitas que representen categorías, actividades, </w:t>
       </w:r>
       <w:proofErr w:type="spellStart"/>
-      <w:proofErr w:type="gramStart"/>
       <w:r>
         <w:t>etc..todos</w:t>
       </w:r>
       <w:proofErr w:type="spellEnd"/>
-      <w:proofErr w:type="gramEnd"/>
       <w:r>
         <w:t xml:space="preserve"> los atributos tendrán una lógica muy intuitiva a la hora que el usuario vea la </w:t>
       </w:r>
@@ -2492,12 +2403,10 @@
         <w:t xml:space="preserve">, por ejemplo, </w:t>
       </w:r>
       <w:proofErr w:type="spellStart"/>
-      <w:proofErr w:type="gramStart"/>
       <w:r>
         <w:t>etc..El</w:t>
       </w:r>
       <w:proofErr w:type="spellEnd"/>
-      <w:proofErr w:type="gramEnd"/>
       <w:r>
         <w:t xml:space="preserve"> agente de AI deberá ser creativo como un diseñador de flujos de trabajo, y de </w:t>
       </w:r>
@@ -2705,17 +2614,12 @@
         <w:t xml:space="preserve"> a la </w:t>
       </w:r>
       <w:proofErr w:type="spellStart"/>
-      <w:proofErr w:type="gramStart"/>
       <w:r>
         <w:t>compañia</w:t>
       </w:r>
       <w:proofErr w:type="spellEnd"/>
       <w:r>
-        <w:t>,.</w:t>
-      </w:r>
-      <w:proofErr w:type="gramEnd"/>
-      <w:r>
-        <w:t xml:space="preserve"> Esta app de reclutamiento de reclutadores freelance les asignará </w:t>
+        <w:t xml:space="preserve">,. Esta app de reclutamiento de reclutadores freelance les asignará </w:t>
       </w:r>
       <w:proofErr w:type="spellStart"/>
       <w:r>
@@ -2787,15 +2691,7 @@
       </w:r>
       <w:proofErr w:type="spellEnd"/>
       <w:r>
-        <w:t xml:space="preserve"> </w:t>
-      </w:r>
-      <w:proofErr w:type="gramStart"/>
-      <w:r>
-        <w:t>leads ,</w:t>
-      </w:r>
-      <w:proofErr w:type="gramEnd"/>
-      <w:r>
-        <w:t xml:space="preserve"> acceso a conversar con lideres e incluso a ser contratado con salario básico, otros beneficios para seguir creciendo en la red de reclutadores. </w:t>
+        <w:t xml:space="preserve"> leads , acceso a conversar con lideres e incluso a ser contratado con salario básico, otros beneficios para seguir creciendo en la red de reclutadores. </w:t>
       </w:r>
       <w:proofErr w:type="spellStart"/>
       <w:r>
@@ -2995,12 +2891,10 @@
         <w:t xml:space="preserve"> si es necesario, que permitan analizar sus mecanismos </w:t>
       </w:r>
       <w:proofErr w:type="spellStart"/>
-      <w:proofErr w:type="gramStart"/>
       <w:r>
         <w:t>comerciales,s</w:t>
       </w:r>
       <w:proofErr w:type="spellEnd"/>
-      <w:proofErr w:type="gramEnd"/>
       <w:r>
         <w:t xml:space="preserve"> u propuesta de valor, su </w:t>
       </w:r>
@@ -3683,6 +3577,7 @@
   <w:style w:type="character" w:default="1" w:styleId="Fuentedeprrafopredeter">
     <w:name w:val="Default Paragraph Font"/>
     <w:uiPriority w:val="1"/>
+    <w:semiHidden/>
     <w:unhideWhenUsed/>
   </w:style>
   <w:style w:type="table" w:default="1" w:styleId="Tablanormal">

</xml_diff>